<commit_message>
Perubahan dokumen BRD untuk iSURF
</commit_message>
<xml_diff>
--- a/docs/standard-docs/01_DKB_BRD/ilkom-2025_Capstone_BRD IoT dan LoRaWAN.docx
+++ b/docs/standard-docs/01_DKB_BRD/ilkom-2025_Capstone_BRD IoT dan LoRaWAN.docx
@@ -3625,8 +3625,8 @@
       </w:pPr>
       <w:bookmarkStart w:id="1" w:name="_Toc113538130"/>
       <w:bookmarkStart w:id="2" w:name="_Toc114210598"/>
-      <w:bookmarkStart w:id="3" w:name="_Hlk114471896"/>
-      <w:bookmarkStart w:id="4" w:name="_Toc198642530"/>
+      <w:bookmarkStart w:id="3" w:name="_Toc198642530"/>
+      <w:bookmarkStart w:id="4" w:name="_Hlk114471896"/>
       <w:r>
         <w:rPr>
           <w:sz w:val="24"/>
@@ -3663,7 +3663,7 @@
         </w:rPr>
         <w:t>)</w:t>
       </w:r>
-      <w:bookmarkEnd w:id="4"/>
+      <w:bookmarkEnd w:id="3"/>
     </w:p>
     <w:tbl>
       <w:tblPr>
@@ -4037,7 +4037,7 @@
           </w:p>
         </w:tc>
       </w:tr>
-      <w:bookmarkEnd w:id="3"/>
+      <w:bookmarkEnd w:id="4"/>
     </w:tbl>
     <w:p>
       <w:pPr>
@@ -13681,8 +13681,8 @@
           <w:szCs w:val="28"/>
         </w:rPr>
       </w:pPr>
-      <w:bookmarkStart w:id="38" w:name="_Toc113522114"/>
-      <w:bookmarkStart w:id="39" w:name="_Toc198642553"/>
+      <w:bookmarkStart w:id="38" w:name="_Toc198642553"/>
+      <w:bookmarkStart w:id="39" w:name="_Toc113522114"/>
       <w:r>
         <w:rPr>
           <w:sz w:val="28"/>
@@ -13691,7 +13691,7 @@
         <w:lastRenderedPageBreak/>
         <w:t>LoRaWAN:</w:t>
       </w:r>
-      <w:bookmarkEnd w:id="39"/>
+      <w:bookmarkEnd w:id="38"/>
     </w:p>
     <w:tbl>
       <w:tblPr>
@@ -14171,7 +14171,7 @@
       <w:r>
         <w:t>)</w:t>
       </w:r>
-      <w:bookmarkEnd w:id="38"/>
+      <w:bookmarkEnd w:id="39"/>
       <w:bookmarkEnd w:id="40"/>
     </w:p>
     <w:p>
@@ -24760,10 +24760,10 @@
   <w:abstractNum w:abstractNumId="74" w15:restartNumberingAfterBreak="0">
     <w:nsid w:val="74C568BA"/>
     <w:multiLevelType w:val="hybridMultilevel"/>
-    <w:tmpl w:val="1C741492"/>
-    <w:lvl w:ilvl="0" w:tplc="FFFFFFFF">
-      <w:start w:val="1"/>
-      <w:numFmt w:val="lowerLetter"/>
+    <w:tmpl w:val="B3FC832A"/>
+    <w:lvl w:ilvl="0" w:tplc="04090011">
+      <w:start w:val="1"/>
+      <w:numFmt w:val="decimal"/>
       <w:lvlText w:val="%1)"/>
       <w:lvlJc w:val="left"/>
       <w:pPr>
@@ -25072,11 +25072,11 @@
   <w:abstractNum w:abstractNumId="77" w15:restartNumberingAfterBreak="0">
     <w:nsid w:val="7C72666A"/>
     <w:multiLevelType w:val="hybridMultilevel"/>
-    <w:tmpl w:val="5E54550A"/>
-    <w:lvl w:ilvl="0" w:tplc="0409000F">
+    <w:tmpl w:val="C0FE5298"/>
+    <w:lvl w:ilvl="0" w:tplc="04090011">
       <w:start w:val="1"/>
       <w:numFmt w:val="decimal"/>
-      <w:lvlText w:val="%1."/>
+      <w:lvlText w:val="%1)"/>
       <w:lvlJc w:val="left"/>
       <w:pPr>
         <w:ind w:left="720" w:hanging="360"/>
@@ -27104,25 +27104,6 @@
 </file>
 
 <file path=customXml/item1.xml><?xml version="1.0" encoding="utf-8"?>
-<p:properties xmlns:p="http://schemas.microsoft.com/office/2006/metadata/properties" xmlns:xsi="http://www.w3.org/2001/XMLSchema-instance" xmlns:pc="http://schemas.microsoft.com/office/infopath/2007/PartnerControls">
-  <documentManagement/>
-</p:properties>
-</file>
-
-<file path=customXml/item2.xml><?xml version="1.0" encoding="utf-8"?>
-<?mso-contentType ?>
-<FormTemplates xmlns="http://schemas.microsoft.com/sharepoint/v3/contenttype/forms">
-  <Display>DocumentLibraryForm</Display>
-  <Edit>DocumentLibraryForm</Edit>
-  <New>DocumentLibraryForm</New>
-</FormTemplates>
-</file>
-
-<file path=customXml/item3.xml><?xml version="1.0" encoding="utf-8"?>
-<b:Sources xmlns:b="http://schemas.openxmlformats.org/officeDocument/2006/bibliography" xmlns="http://schemas.openxmlformats.org/officeDocument/2006/bibliography" SelectedStyle="\APASixthEditionOfficeOnline.xsl" StyleName="APA" Version="6"/>
-</file>
-
-<file path=customXml/item4.xml><?xml version="1.0" encoding="utf-8"?>
 <ct:contentTypeSchema xmlns:ct="http://schemas.microsoft.com/office/2006/metadata/contentType" xmlns:ma="http://schemas.microsoft.com/office/2006/metadata/properties/metaAttributes" ct:_="" ma:_="" ma:contentTypeName="Document" ma:contentTypeID="0x010100C7A4CF3E9A5C214E8ED5E2FFFBBDFAF2" ma:contentTypeVersion="12" ma:contentTypeDescription="Create a new document." ma:contentTypeScope="" ma:versionID="de3eeb07b9c1bc5b448676d950a48cf8">
   <xsd:schema xmlns:xsd="http://www.w3.org/2001/XMLSchema" xmlns:xs="http://www.w3.org/2001/XMLSchema" xmlns:p="http://schemas.microsoft.com/office/2006/metadata/properties" xmlns:ns3="d9316f96-e9f8-4ce7-b0f0-a6aa6696b650" targetNamespace="http://schemas.microsoft.com/office/2006/metadata/properties" ma:root="true" ma:fieldsID="5cdd74dd700dbc0dbb76384642acdea4" ns3:_="">
     <xsd:import namespace="d9316f96-e9f8-4ce7-b0f0-a6aa6696b650"/>
@@ -27318,32 +27299,26 @@
 </ct:contentTypeSchema>
 </file>
 
-<file path=customXml/itemProps1.xml><?xml version="1.0" encoding="utf-8"?>
-<ds:datastoreItem xmlns:ds="http://schemas.openxmlformats.org/officeDocument/2006/customXml" ds:itemID="{10689B1D-F070-442E-B886-5D65239552E2}">
-  <ds:schemaRefs>
-    <ds:schemaRef ds:uri="http://schemas.microsoft.com/office/2006/metadata/properties"/>
-    <ds:schemaRef ds:uri="http://schemas.microsoft.com/office/infopath/2007/PartnerControls"/>
-  </ds:schemaRefs>
-</ds:datastoreItem>
+<file path=customXml/item2.xml><?xml version="1.0" encoding="utf-8"?>
+<p:properties xmlns:p="http://schemas.microsoft.com/office/2006/metadata/properties" xmlns:xsi="http://www.w3.org/2001/XMLSchema-instance" xmlns:pc="http://schemas.microsoft.com/office/infopath/2007/PartnerControls">
+  <documentManagement/>
+</p:properties>
 </file>
 
-<file path=customXml/itemProps2.xml><?xml version="1.0" encoding="utf-8"?>
-<ds:datastoreItem xmlns:ds="http://schemas.openxmlformats.org/officeDocument/2006/customXml" ds:itemID="{C0946FB2-1FBC-4E3D-ADBF-CDEC9B00759C}">
-  <ds:schemaRefs>
-    <ds:schemaRef ds:uri="http://schemas.microsoft.com/sharepoint/v3/contenttype/forms"/>
-  </ds:schemaRefs>
-</ds:datastoreItem>
+<file path=customXml/item3.xml><?xml version="1.0" encoding="utf-8"?>
+<?mso-contentType ?>
+<FormTemplates xmlns="http://schemas.microsoft.com/sharepoint/v3/contenttype/forms">
+  <Display>DocumentLibraryForm</Display>
+  <Edit>DocumentLibraryForm</Edit>
+  <New>DocumentLibraryForm</New>
+</FormTemplates>
 </file>
 
-<file path=customXml/itemProps3.xml><?xml version="1.0" encoding="utf-8"?>
-<ds:datastoreItem xmlns:ds="http://schemas.openxmlformats.org/officeDocument/2006/customXml" ds:itemID="{BBBB1E30-F27B-40EE-9801-034FD738D605}">
-  <ds:schemaRefs>
-    <ds:schemaRef ds:uri="http://schemas.openxmlformats.org/officeDocument/2006/bibliography"/>
-  </ds:schemaRefs>
-</ds:datastoreItem>
+<file path=customXml/item4.xml><?xml version="1.0" encoding="utf-8"?>
+<b:Sources xmlns:b="http://schemas.openxmlformats.org/officeDocument/2006/bibliography" xmlns="http://schemas.openxmlformats.org/officeDocument/2006/bibliography" SelectedStyle="\APASixthEditionOfficeOnline.xsl" StyleName="APA" Version="6"/>
 </file>
 
-<file path=customXml/itemProps4.xml><?xml version="1.0" encoding="utf-8"?>
+<file path=customXml/itemProps1.xml><?xml version="1.0" encoding="utf-8"?>
 <ds:datastoreItem xmlns:ds="http://schemas.openxmlformats.org/officeDocument/2006/customXml" ds:itemID="{541079CB-DD0A-4263-BEE4-0E6AECAACA0D}">
   <ds:schemaRefs>
     <ds:schemaRef ds:uri="http://schemas.microsoft.com/office/2006/metadata/contentType"/>
@@ -27359,4 +27334,29 @@
     <ds:schemaRef ds:uri="http://schemas.microsoft.com/internal/obd"/>
   </ds:schemaRefs>
 </ds:datastoreItem>
+</file>
+
+<file path=customXml/itemProps2.xml><?xml version="1.0" encoding="utf-8"?>
+<ds:datastoreItem xmlns:ds="http://schemas.openxmlformats.org/officeDocument/2006/customXml" ds:itemID="{10689B1D-F070-442E-B886-5D65239552E2}">
+  <ds:schemaRefs>
+    <ds:schemaRef ds:uri="http://schemas.microsoft.com/office/2006/metadata/properties"/>
+    <ds:schemaRef ds:uri="http://schemas.microsoft.com/office/infopath/2007/PartnerControls"/>
+  </ds:schemaRefs>
+</ds:datastoreItem>
+</file>
+
+<file path=customXml/itemProps3.xml><?xml version="1.0" encoding="utf-8"?>
+<ds:datastoreItem xmlns:ds="http://schemas.openxmlformats.org/officeDocument/2006/customXml" ds:itemID="{C0946FB2-1FBC-4E3D-ADBF-CDEC9B00759C}">
+  <ds:schemaRefs>
+    <ds:schemaRef ds:uri="http://schemas.microsoft.com/sharepoint/v3/contenttype/forms"/>
+  </ds:schemaRefs>
+</ds:datastoreItem>
+</file>
+
+<file path=customXml/itemProps4.xml><?xml version="1.0" encoding="utf-8"?>
+<ds:datastoreItem xmlns:ds="http://schemas.openxmlformats.org/officeDocument/2006/customXml" ds:itemID="{BBBB1E30-F27B-40EE-9801-034FD738D605}">
+  <ds:schemaRefs>
+    <ds:schemaRef ds:uri="http://schemas.openxmlformats.org/officeDocument/2006/bibliography"/>
+  </ds:schemaRefs>
+</ds:datastoreItem>
 </file>
</xml_diff>